<commit_message>
Update .yaml personality model and update panelist / roles to accomodate.
</commit_message>
<xml_diff>
--- a/Why  I built a talk show.docx
+++ b/Why  I built a talk show.docx
@@ -61,7 +61,19 @@
         <w:t>US</w:t>
       </w:r>
       <w:r>
-        <w:t xml:space="preserve"> highway system. "Johnny, you are the navigator for this trip. I’m </w:t>
+        <w:t xml:space="preserve"> highway system. "Johnny, you </w:t>
+      </w:r>
+      <w:r>
+        <w:t xml:space="preserve">and Julie </w:t>
+      </w:r>
+      <w:r>
+        <w:t>are the navigator</w:t>
+      </w:r>
+      <w:r>
+        <w:t>s</w:t>
+      </w:r>
+      <w:r>
+        <w:t xml:space="preserve"> for this trip. I’m </w:t>
       </w:r>
       <w:proofErr w:type="gramStart"/>
       <w:r>

</xml_diff>